<commit_message>
Changes to champion documents and class diagram
</commit_message>
<xml_diff>
--- a/doc/kade/McRae Champion Doc.docx
+++ b/doc/kade/McRae Champion Doc.docx
@@ -135,14 +135,14 @@
         <w:rPr/>
         <w:drawing>
           <wp:inline distB="114300" distT="114300" distL="114300" distR="114300">
-            <wp:extent cx="5214938" cy="2699399"/>
+            <wp:extent cx="5943600" cy="3073400"/>
             <wp:effectExtent b="0" l="0" r="0" t="0"/>
-            <wp:docPr id="3" name="image1.png"/>
+            <wp:docPr id="3" name="image2.png"/>
             <a:graphic>
               <a:graphicData uri="http://schemas.openxmlformats.org/drawingml/2006/picture">
                 <pic:pic>
                   <pic:nvPicPr>
-                    <pic:cNvPr id="0" name="image1.png"/>
+                    <pic:cNvPr id="0" name="image2.png"/>
                     <pic:cNvPicPr preferRelativeResize="0"/>
                   </pic:nvPicPr>
                   <pic:blipFill>
@@ -155,7 +155,7 @@
                   <pic:spPr>
                     <a:xfrm>
                       <a:off x="0" y="0"/>
-                      <a:ext cx="5214938" cy="2699399"/>
+                      <a:ext cx="5943600" cy="3073400"/>
                     </a:xfrm>
                     <a:prstGeom prst="rect"/>
                     <a:ln/>
@@ -364,13 +364,58 @@
           <w:bCs w:val="1"/>
           <w:rtl w:val="0"/>
         </w:rPr>
-        <w:t xml:space="preserve">Step 3:</w:t>
+        <w:t xml:space="preserve">Step 3: </w:t>
+      </w:r>
+      <w:r>
+        <w:rPr>
+          <w:rtl w:val="0"/>
+        </w:rPr>
+        <w:t xml:space="preserve">System checks risk factor value to see if player can be </w:t>
+      </w:r>
+      <w:r>
+        <w:rPr>
+          <w:rtl w:val="0"/>
+        </w:rPr>
+        <w:t xml:space="preserve">arrested and checks for</w:t>
+      </w:r>
+      <w:r>
+        <w:rPr>
+          <w:rtl w:val="0"/>
+        </w:rPr>
+        <w:t xml:space="preserve"> data corruption.</w:t>
+      </w:r>
+    </w:p>
+    <w:p>
+      <w:pPr>
+        <w:spacing w:after="0" w:lineRule="auto"/>
+        <w:ind w:left="2160" w:firstLine="0"/>
+        <w:rPr/>
+      </w:pPr>
+      <w:r>
+        <w:rPr>
+          <w:b w:val="1"/>
+          <w:bCs w:val="1"/>
+          <w:rtl w:val="0"/>
+        </w:rPr>
+        <w:t xml:space="preserve">Step 4:</w:t>
       </w:r>
       <w:r>
         <w:rPr>
           <w:rtl w:val="0"/>
         </w:rPr>
         <w:t xml:space="preserve"> System updates the UI to show the updated stat. </w:t>
+      </w:r>
+    </w:p>
+    <w:p>
+      <w:pPr>
+        <w:spacing w:after="0" w:lineRule="auto"/>
+        <w:ind w:left="2160" w:firstLine="0"/>
+        <w:rPr/>
+      </w:pPr>
+      <w:r>
+        <w:rPr>
+          <w:rtl w:val="0"/>
+        </w:rPr>
       </w:r>
     </w:p>
     <w:p>
@@ -568,6 +613,51 @@
     </w:p>
     <w:p>
       <w:pPr>
+        <w:rPr/>
+      </w:pPr>
+      <w:r>
+        <w:rPr/>
+        <w:drawing>
+          <wp:inline distB="114300" distT="114300" distL="114300" distR="114300">
+            <wp:extent cx="4400550" cy="1304925"/>
+            <wp:effectExtent b="0" l="0" r="0" t="0"/>
+            <wp:docPr id="5" name="image1.png"/>
+            <a:graphic>
+              <a:graphicData uri="http://schemas.openxmlformats.org/drawingml/2006/picture">
+                <pic:pic>
+                  <pic:nvPicPr>
+                    <pic:cNvPr id="0" name="image1.png"/>
+                    <pic:cNvPicPr preferRelativeResize="0"/>
+                  </pic:nvPicPr>
+                  <pic:blipFill>
+                    <a:blip r:embed="rId7"/>
+                    <a:srcRect b="0" l="0" r="0" t="0"/>
+                    <a:stretch>
+                      <a:fillRect/>
+                    </a:stretch>
+                  </pic:blipFill>
+                  <pic:spPr>
+                    <a:xfrm>
+                      <a:off x="0" y="0"/>
+                      <a:ext cx="4400550" cy="1304925"/>
+                    </a:xfrm>
+                    <a:prstGeom prst="rect"/>
+                    <a:ln/>
+                  </pic:spPr>
+                </pic:pic>
+              </a:graphicData>
+            </a:graphic>
+          </wp:inline>
+        </w:drawing>
+      </w:r>
+      <w:r>
+        <w:rPr>
+          <w:rtl w:val="0"/>
+        </w:rPr>
+      </w:r>
+    </w:p>
+    <w:p>
+      <w:pPr>
         <w:ind w:left="720" w:firstLine="0"/>
         <w:rPr/>
       </w:pPr>
@@ -577,16 +667,16 @@
           <wp:inline distB="114300" distT="114300" distL="114300" distR="114300">
             <wp:extent cx="5586413" cy="2868444"/>
             <wp:effectExtent b="0" l="0" r="0" t="0"/>
-            <wp:docPr id="1" name="image3.png"/>
+            <wp:docPr id="1" name="image4.png"/>
             <a:graphic>
               <a:graphicData uri="http://schemas.openxmlformats.org/drawingml/2006/picture">
                 <pic:pic>
                   <pic:nvPicPr>
-                    <pic:cNvPr id="0" name="image3.png"/>
+                    <pic:cNvPr id="0" name="image4.png"/>
                     <pic:cNvPicPr preferRelativeResize="0"/>
                   </pic:nvPicPr>
                   <pic:blipFill>
-                    <a:blip r:embed="rId7"/>
+                    <a:blip r:embed="rId8"/>
                     <a:srcRect b="0" l="0" r="0" t="0"/>
                     <a:stretch>
                       <a:fillRect/>
@@ -623,16 +713,16 @@
           <wp:inline distB="114300" distT="114300" distL="114300" distR="114300">
             <wp:extent cx="5789262" cy="3370594"/>
             <wp:effectExtent b="0" l="0" r="0" t="0"/>
-            <wp:docPr id="4" name="image2.png"/>
+            <wp:docPr id="4" name="image5.png"/>
             <a:graphic>
               <a:graphicData uri="http://schemas.openxmlformats.org/drawingml/2006/picture">
                 <pic:pic>
                   <pic:nvPicPr>
-                    <pic:cNvPr id="0" name="image2.png"/>
+                    <pic:cNvPr id="0" name="image5.png"/>
                     <pic:cNvPicPr preferRelativeResize="0"/>
                   </pic:nvPicPr>
                   <pic:blipFill>
-                    <a:blip r:embed="rId8"/>
+                    <a:blip r:embed="rId9"/>
                     <a:srcRect b="0" l="0" r="0" t="0"/>
                     <a:stretch>
                       <a:fillRect/>
@@ -5094,16 +5184,16 @@
           <wp:inline distB="114300" distT="114300" distL="114300" distR="114300">
             <wp:extent cx="5943600" cy="2463800"/>
             <wp:effectExtent b="0" l="0" r="0" t="0"/>
-            <wp:docPr id="2" name="image4.png"/>
+            <wp:docPr id="2" name="image3.png"/>
             <a:graphic>
               <a:graphicData uri="http://schemas.openxmlformats.org/drawingml/2006/picture">
                 <pic:pic>
                   <pic:nvPicPr>
-                    <pic:cNvPr id="0" name="image4.png"/>
+                    <pic:cNvPr id="0" name="image3.png"/>
                     <pic:cNvPicPr preferRelativeResize="0"/>
                   </pic:nvPicPr>
                   <pic:blipFill>
-                    <a:blip r:embed="rId9"/>
+                    <a:blip r:embed="rId10"/>
                     <a:srcRect b="0" l="0" r="0" t="0"/>
                     <a:stretch>
                       <a:fillRect/>

</xml_diff>